<commit_message>
Modernize container dependencies and adopt uv and Vite
</commit_message>
<xml_diff>
--- a/web/test/files/export/export-casebook-no-annotations.docx
+++ b/web/test/files/export/export-casebook-no-annotations.docx
@@ -90,7 +90,7 @@
       <w:r>
         <w:t xml:space="preserve"> </w:t>
       </w:r>
-      <w:hyperlink r:id="rId20">
+      <w:hyperlink r:id="rId61">
         <w:r>
           <w:rPr>
             <w:rStyle w:val="Hyperlink"/>
@@ -111,8 +111,8 @@
       </w:pPr>
       <w:r>
         <w:rPr>
+          <w:b/>
           <w:bCs/>
-          <w:b/>
         </w:rPr>
         <w:t xml:space="preserve">Remember:</w:t>
       </w:r>
@@ -179,8 +179,8 @@
                 <w:iCs/>
               </w:rPr>
               <w:t>
-            1
-          </w:t>
+                1
+              </w:t>
             </w:r>
             <w:r>
               <w:rPr>
@@ -196,8 +196,8 @@
                 <w:iCs/>
               </w:rPr>
               <w:t>
-            Ampersand &amp; Ampersand; a fish drawing &gt;&lt;&gt;
-          </w:t>
+                Ampersand &amp; Ampersand; a fish drawing &gt;&lt;&gt;
+              </w:t>
             </w:r>
             <w:r>
               <w:rPr>
@@ -264,8 +264,8 @@
                 <w:iCs/>
               </w:rPr>
               <w:t>
-            1.1
-          </w:t>
+                1.1
+              </w:t>
             </w:r>
             <w:r>
               <w:rPr>
@@ -281,8 +281,8 @@
                 <w:iCs/>
               </w:rPr>
               <w:t>
-            Legal Doc 0
-          </w:t>
+                Legal Doc 0
+              </w:t>
             </w:r>
             <w:r>
               <w:rPr>
@@ -349,8 +349,8 @@
                 <w:iCs/>
               </w:rPr>
               <w:t>
-            1.2
-          </w:t>
+                1.2
+              </w:t>
             </w:r>
             <w:r>
               <w:rPr>
@@ -366,8 +366,8 @@
                 <w:iCs/>
               </w:rPr>
               <w:t>
-            Some TextBlock Name 0
-          </w:t>
+                Some TextBlock Name 0
+              </w:t>
             </w:r>
             <w:r>
               <w:rPr>
@@ -434,8 +434,8 @@
                 <w:iCs/>
               </w:rPr>
               <w:t>
-            1.3
-          </w:t>
+                1.3
+              </w:t>
             </w:r>
             <w:r>
               <w:rPr>
@@ -451,8 +451,8 @@
                 <w:iCs/>
               </w:rPr>
               <w:t>
-            Some Link Name 0
-          </w:t>
+                Some Link Name 0
+              </w:t>
             </w:r>
             <w:r>
               <w:rPr>
@@ -515,12 +515,12 @@
       <w:pPr>
         <w:pStyle w:val="FrontMatterEnd"/>
         <w:sectPr>
-          <w:footerReference w:type="even" r:id="rId14"/>
-          <w:footerReference w:type="default" r:id="rId14"/>
-          <w:headerReference w:type="even" r:id="rId9"/>
-          <w:headerReference w:type="default" r:id="rId10"/>
-          <w:footerReference w:type="first" r:id="rId15"/>
-          <w:headerReference w:type="first" r:id="rId13"/>
+          <w:footerReference w:type="even" r:id="rId51"/>
+          <w:footerReference w:type="default" r:id="rId51"/>
+          <w:headerReference w:type="even" r:id="rId44"/>
+          <w:headerReference w:type="default" r:id="rId45"/>
+          <w:footerReference w:type="first" r:id="rId52"/>
+          <w:headerReference w:type="first" r:id="rId43"/>
           <w:type w:val="continuous"/>
           <w:pgSz w:h="15840" w:w="12240"/>
           <w:pgMar w:bottom="1440" w:gutter="720" w:header="1440" w:left="1440" w:right="1440" w:top="1800"/>
@@ -610,10 +610,10 @@
       <w:pPr>
         <w:pStyle w:val="HeadEnd"/>
         <w:sectPr>
-          <w:footerReference w:type="even" r:id="rId14"/>
-          <w:footerReference w:type="default" r:id="rId14"/>
-          <w:headerReference w:type="even" r:id="rId11"/>
-          <w:headerReference w:type="default" r:id="rId12"/>
+          <w:footerReference w:type="even" r:id="rId51"/>
+          <w:footerReference w:type="default" r:id="rId51"/>
+          <w:headerReference w:type="even" r:id="rId41"/>
+          <w:headerReference w:type="default" r:id="rId42"/>
           <w:type w:val="oddPage"/>
           <w:pgSz w:h="15840" w:w="12240"/>
           <w:pgMar w:bottom="1440" w:gutter="720" w:header="1440" w:left="1440" w:right="1440" w:top="1800"/>
@@ -890,7 +890,7 @@
       <w:pPr>
         <w:pStyle w:val="ResourceLink"/>
       </w:pPr>
-      <w:hyperlink r:id="rId21">
+      <w:hyperlink r:id="rId62">
         <w:r>
           <w:rPr>
             <w:rStyle w:val="Hyperlink"/>
@@ -1214,14 +1214,14 @@
 <file path=word/numbering.xml><?xml version="1.0" encoding="utf-8"?>
 <w:numbering xmlns:w="http://schemas.openxmlformats.org/wordprocessingml/2006/main">
   <w:abstractNum w:abstractNumId="990">
-    <w:nsid w:val="A990"/>
+    <w:nsid w:val="0000A990"/>
     <w:multiLevelType w:val="multilevel"/>
     <w:lvl w:ilvl="0">
       <w:numFmt w:val="bullet"/>
       <w:lvlText w:val=" "/>
       <w:lvlJc w:val="left"/>
       <w:pPr>
-        <w:ind w:left="720" w:hanging="480"/>
+        <w:ind w:left="720" w:hanging="360"/>
       </w:pPr>
     </w:lvl>
     <w:lvl w:ilvl="1">
@@ -1229,7 +1229,7 @@
       <w:lvlText w:val=" "/>
       <w:lvlJc w:val="left"/>
       <w:pPr>
-        <w:ind w:left="1440" w:hanging="480"/>
+        <w:ind w:left="1440" w:hanging="360"/>
       </w:pPr>
     </w:lvl>
     <w:lvl w:ilvl="2">
@@ -1237,7 +1237,7 @@
       <w:lvlText w:val=" "/>
       <w:lvlJc w:val="left"/>
       <w:pPr>
-        <w:ind w:left="2160" w:hanging="480"/>
+        <w:ind w:left="2160" w:hanging="360"/>
       </w:pPr>
     </w:lvl>
     <w:lvl w:ilvl="3">
@@ -1245,7 +1245,7 @@
       <w:lvlText w:val=" "/>
       <w:lvlJc w:val="left"/>
       <w:pPr>
-        <w:ind w:left="2880" w:hanging="480"/>
+        <w:ind w:left="2880" w:hanging="360"/>
       </w:pPr>
     </w:lvl>
     <w:lvl w:ilvl="4">
@@ -1253,7 +1253,7 @@
       <w:lvlText w:val=" "/>
       <w:lvlJc w:val="left"/>
       <w:pPr>
-        <w:ind w:left="3600" w:hanging="480"/>
+        <w:ind w:left="3600" w:hanging="360"/>
       </w:pPr>
     </w:lvl>
     <w:lvl w:ilvl="5">
@@ -1261,7 +1261,7 @@
       <w:lvlText w:val=" "/>
       <w:lvlJc w:val="left"/>
       <w:pPr>
-        <w:ind w:left="4320" w:hanging="480"/>
+        <w:ind w:left="4320" w:hanging="360"/>
       </w:pPr>
     </w:lvl>
     <w:lvl w:ilvl="6">
@@ -1269,7 +1269,7 @@
       <w:lvlText w:val=" "/>
       <w:lvlJc w:val="left"/>
       <w:pPr>
-        <w:ind w:left="5040" w:hanging="480"/>
+        <w:ind w:left="5040" w:hanging="360"/>
       </w:pPr>
     </w:lvl>
     <w:lvl w:ilvl="7">
@@ -1277,7 +1277,7 @@
       <w:lvlText w:val=" "/>
       <w:lvlJc w:val="left"/>
       <w:pPr>
-        <w:ind w:left="5760" w:hanging="480"/>
+        <w:ind w:left="5760" w:hanging="360"/>
       </w:pPr>
     </w:lvl>
     <w:lvl w:ilvl="8">
@@ -1285,91 +1285,12 @@
       <w:lvlText w:val=" "/>
       <w:lvlJc w:val="left"/>
       <w:pPr>
-        <w:ind w:left="6480" w:hanging="480"/>
-      </w:pPr>
-    </w:lvl>
-  </w:abstractNum>
-  <w:abstractNum w:abstractNumId="991">
-    <w:nsid w:val="A991"/>
-    <w:multiLevelType w:val="multilevel"/>
-    <w:lvl w:ilvl="0">
-      <w:numFmt w:val="bullet"/>
-      <w:lvlText w:val="•"/>
-      <w:lvlJc w:val="left"/>
-      <w:pPr>
-        <w:ind w:left="720" w:hanging="480"/>
-      </w:pPr>
-    </w:lvl>
-    <w:lvl w:ilvl="1">
-      <w:numFmt w:val="bullet"/>
-      <w:lvlText w:val="–"/>
-      <w:lvlJc w:val="left"/>
-      <w:pPr>
-        <w:ind w:left="1440" w:hanging="480"/>
-      </w:pPr>
-    </w:lvl>
-    <w:lvl w:ilvl="2">
-      <w:numFmt w:val="bullet"/>
-      <w:lvlText w:val="•"/>
-      <w:lvlJc w:val="left"/>
-      <w:pPr>
-        <w:ind w:left="2160" w:hanging="480"/>
-      </w:pPr>
-    </w:lvl>
-    <w:lvl w:ilvl="3">
-      <w:numFmt w:val="bullet"/>
-      <w:lvlText w:val="–"/>
-      <w:lvlJc w:val="left"/>
-      <w:pPr>
-        <w:ind w:left="2880" w:hanging="480"/>
-      </w:pPr>
-    </w:lvl>
-    <w:lvl w:ilvl="4">
-      <w:numFmt w:val="bullet"/>
-      <w:lvlText w:val="•"/>
-      <w:lvlJc w:val="left"/>
-      <w:pPr>
-        <w:ind w:left="3600" w:hanging="480"/>
-      </w:pPr>
-    </w:lvl>
-    <w:lvl w:ilvl="5">
-      <w:numFmt w:val="bullet"/>
-      <w:lvlText w:val="–"/>
-      <w:lvlJc w:val="left"/>
-      <w:pPr>
-        <w:ind w:left="4320" w:hanging="480"/>
-      </w:pPr>
-    </w:lvl>
-    <w:lvl w:ilvl="6">
-      <w:numFmt w:val="bullet"/>
-      <w:lvlText w:val="•"/>
-      <w:lvlJc w:val="left"/>
-      <w:pPr>
-        <w:ind w:left="5040" w:hanging="480"/>
-      </w:pPr>
-    </w:lvl>
-    <w:lvl w:ilvl="7">
-      <w:numFmt w:val="bullet"/>
-      <w:lvlText w:val="–"/>
-      <w:lvlJc w:val="left"/>
-      <w:pPr>
-        <w:ind w:left="5760" w:hanging="480"/>
-      </w:pPr>
-    </w:lvl>
-    <w:lvl w:ilvl="8">
-      <w:numFmt w:val="bullet"/>
-      <w:lvlText w:val="•"/>
-      <w:lvlJc w:val="left"/>
-      <w:pPr>
-        <w:ind w:left="6480" w:hanging="480"/>
+        <w:ind w:left="6480" w:hanging="360"/>
       </w:pPr>
     </w:lvl>
   </w:abstractNum>
   <w:num w:numId="1000">
     <w:abstractNumId w:val="990"/>
-  </w:num>
-  <w:num w:numId="1001">
-    <w:abstractNumId w:val="991"/>
   </w:num>
 </w:numbering>
 </file>

</xml_diff>